<commit_message>
ex 5 win api working :)
</commit_message>
<xml_diff>
--- a/חפיפה כללי.docx
+++ b/חפיפה כללי.docx
@@ -814,6 +814,14 @@
           <w:rFonts w:ascii="Lucida Console" w:hAnsi="Lucida Console" w:cs="Lucida Console"/>
           <w:sz w:val="18"/>
           <w:szCs w:val="18"/>
+        </w:rPr>
+        <w:t>c</w:t>
+      </w:r>
+      <w:r>
+        <w:rPr>
+          <w:rFonts w:ascii="Lucida Console" w:hAnsi="Lucida Console" w:cs="Lucida Console"/>
+          <w:sz w:val="18"/>
+          <w:szCs w:val="18"/>
           <w:rtl/>
         </w:rPr>
         <w:t>lang -g -Wall -std=c99 -o &lt;executablename&gt; &lt;sourcefiles</w:t>
@@ -880,13 +888,8 @@
         <w:jc w:val="right"/>
       </w:pPr>
       <w:r>
-        <w:t xml:space="preserve">clang -g -Wall file1.c -c clang -g -Wall file2.c -c clang -g -Wall file3.c -c clang -g file1.o file2.o file3.o -o </w:t>
-      </w:r>
-      <w:proofErr w:type="spellStart"/>
-      <w:r>
-        <w:t>myprogram</w:t>
-      </w:r>
-      <w:proofErr w:type="spellEnd"/>
+        <w:t>clang -g -Wall file1.c -c clang -g -Wall file2.c -c clang -g -Wall file3.c -c clang -g file1.o file2.o file3.o -o myprogram</w:t>
+      </w:r>
     </w:p>
     <w:p>
       <w:pPr>

</xml_diff>